<commit_message>
number of invoice is requered
</commit_message>
<xml_diff>
--- a/documents/templates_word/invoice_template.docx
+++ b/documents/templates_word/invoice_template.docx
@@ -13,7 +13,7 @@
       </w:tblGrid>
       <w:tr>
         <w:trPr>
-          <w:trHeight w:val="464"/>
+          <w:trHeight w:val="509"/>
         </w:trPr>
         <w:tc>
           <w:tcPr>
@@ -40,6 +40,8 @@
                 <w:lang w:eastAsia="ru-RU"/>
               </w:rPr>
             </w:pPr>
+            <w:bookmarkStart w:id="0" w:name="_GoBack"/>
+            <w:bookmarkEnd w:id="0"/>
             <w:r>
               <w:rPr>
                 <w:rFonts w:ascii="Times New Roman" w:eastAsia="Times New Roman" w:hAnsi="Times New Roman" w:cs="Times New Roman"/>
@@ -53,10 +55,10 @@
                 <wp:anchor distT="0" distB="0" distL="114300" distR="114300" simplePos="0" relativeHeight="251658240" behindDoc="0" locked="0" layoutInCell="1" allowOverlap="1">
                   <wp:simplePos x="0" y="0"/>
                   <wp:positionH relativeFrom="column">
-                    <wp:posOffset>137160</wp:posOffset>
+                    <wp:posOffset>1760220</wp:posOffset>
                   </wp:positionH>
                   <wp:positionV relativeFrom="paragraph">
-                    <wp:posOffset>60960</wp:posOffset>
+                    <wp:posOffset>-91440</wp:posOffset>
                   </wp:positionV>
                   <wp:extent cx="1584960" cy="472440"/>
                   <wp:effectExtent l="0" t="0" r="0" b="3810"/>
@@ -64,7 +66,7 @@
                   <wp:docPr id="11" name="Рисунок 11">
                     <a:extLst xmlns:a="http://schemas.openxmlformats.org/drawingml/2006/main">
                       <a:ext uri="{FF2B5EF4-FFF2-40B4-BE49-F238E27FC236}">
-                        <a16:creationId xmlns:a16="http://schemas.microsoft.com/office/drawing/2014/main" xmlns:lc="http://schemas.openxmlformats.org/drawingml/2006/lockedCanvas" xmlns="" id="{00000000-0008-0000-0000-00000B000000}"/>
+                        <a16:creationId xmlns:o="urn:schemas-microsoft-com:office:office" xmlns:v="urn:schemas-microsoft-com:vml" xmlns:w10="urn:schemas-microsoft-com:office:word" xmlns:w="http://schemas.openxmlformats.org/wordprocessingml/2006/main" xmlns:a16="http://schemas.microsoft.com/office/drawing/2014/main" xmlns:lc="http://schemas.openxmlformats.org/drawingml/2006/lockedCanvas" xmlns="" id="{00000000-0008-0000-0000-00000B000000}"/>
                       </a:ext>
                     </a:extLst>
                   </wp:docPr>
@@ -76,7 +78,7 @@
                           <pic:cNvPr id="11" name="Рисунок 1348">
                             <a:extLst>
                               <a:ext uri="{FF2B5EF4-FFF2-40B4-BE49-F238E27FC236}">
-                                <a16:creationId xmlns:a16="http://schemas.microsoft.com/office/drawing/2014/main" xmlns:lc="http://schemas.openxmlformats.org/drawingml/2006/lockedCanvas" xmlns="" id="{00000000-0008-0000-0000-00000B000000}"/>
+                                <a16:creationId xmlns:o="urn:schemas-microsoft-com:office:office" xmlns:v="urn:schemas-microsoft-com:vml" xmlns:w10="urn:schemas-microsoft-com:office:word" xmlns:w="http://schemas.openxmlformats.org/wordprocessingml/2006/main" xmlns:a16="http://schemas.microsoft.com/office/drawing/2014/main" xmlns:lc="http://schemas.openxmlformats.org/drawingml/2006/lockedCanvas" xmlns="" id="{00000000-0008-0000-0000-00000B000000}"/>
                               </a:ext>
                             </a:extLst>
                           </pic:cNvPr>
@@ -100,7 +102,7 @@
                         <pic:spPr bwMode="auto">
                           <a:xfrm>
                             <a:off x="0" y="0"/>
-                            <a:ext cx="1592580" cy="473710"/>
+                            <a:ext cx="1584960" cy="472440"/>
                           </a:xfrm>
                           <a:prstGeom prst="rect">
                             <a:avLst/>
@@ -446,98 +448,174 @@
     </w:tbl>
     <w:p/>
     <w:p>
-      <w:r>
-        <w:t>СЧЁТ №</w:t>
-      </w:r>
-      <w:bookmarkStart w:id="0" w:name="_GoBack"/>
-      <w:bookmarkEnd w:id="0"/>
-    </w:p>
-    <w:p>
-      <w:r>
-        <w:t xml:space="preserve"> {{ </w:t>
+      <w:pPr>
+        <w:rPr>
+          <w:rFonts w:ascii="Times New Roman" w:hAnsi="Times New Roman" w:cs="Times New Roman"/>
+          <w:sz w:val="24"/>
+          <w:szCs w:val="24"/>
+        </w:rPr>
+      </w:pPr>
+      <w:r>
+        <w:rPr>
+          <w:rFonts w:ascii="Times New Roman" w:hAnsi="Times New Roman" w:cs="Times New Roman"/>
+          <w:sz w:val="24"/>
+          <w:szCs w:val="24"/>
+        </w:rPr>
+        <w:t>СЧЕТ</w:t>
+      </w:r>
+      <w:r>
+        <w:rPr>
+          <w:rFonts w:ascii="Times New Roman" w:hAnsi="Times New Roman" w:cs="Times New Roman"/>
+          <w:sz w:val="24"/>
+          <w:szCs w:val="24"/>
+        </w:rPr>
+        <w:t xml:space="preserve"> № {{ </w:t>
       </w:r>
       <w:proofErr w:type="spellStart"/>
       <w:r>
+        <w:rPr>
+          <w:rFonts w:ascii="Times New Roman" w:hAnsi="Times New Roman" w:cs="Times New Roman"/>
+          <w:sz w:val="24"/>
+          <w:szCs w:val="24"/>
+        </w:rPr>
         <w:t>number</w:t>
       </w:r>
       <w:proofErr w:type="spellEnd"/>
-      <w:proofErr w:type="gramStart"/>
-      <w:r>
-        <w:t xml:space="preserve"> }</w:t>
-      </w:r>
-      <w:proofErr w:type="gramEnd"/>
-      <w:r>
-        <w:t>}</w:t>
-      </w:r>
-    </w:p>
-    <w:p>
-      <w:r>
-        <w:t xml:space="preserve">Дата: </w:t>
-      </w:r>
-    </w:p>
-    <w:p>
-      <w:r>
-        <w:t xml:space="preserve">{{ </w:t>
-      </w:r>
-      <w:proofErr w:type="spellStart"/>
-      <w:r>
-        <w:t>date</w:t>
-      </w:r>
-      <w:proofErr w:type="spellEnd"/>
-      <w:proofErr w:type="gramStart"/>
-      <w:r>
-        <w:t xml:space="preserve"> }</w:t>
-      </w:r>
-      <w:proofErr w:type="gramEnd"/>
-      <w:r>
-        <w:t>}</w:t>
-      </w:r>
-    </w:p>
-    <w:p/>
-    <w:p>
-      <w:r>
-        <w:t xml:space="preserve">Поставщик: </w:t>
-      </w:r>
-      <w:r>
-        <w:rPr>
-          <w:rFonts w:ascii="Microsoft Sans Serif" w:eastAsia="Times New Roman" w:hAnsi="Microsoft Sans Serif" w:cs="Microsoft Sans Serif"/>
-          <w:sz w:val="18"/>
-          <w:szCs w:val="18"/>
-          <w:lang w:eastAsia="ru-RU"/>
-        </w:rPr>
-        <w:t>ООО «АЯКС» ИНН 7451432609 КПП 744701001</w:t>
+      <w:r>
+        <w:rPr>
+          <w:rFonts w:ascii="Times New Roman" w:hAnsi="Times New Roman" w:cs="Times New Roman"/>
+          <w:sz w:val="24"/>
+          <w:szCs w:val="24"/>
+        </w:rPr>
+        <w:t xml:space="preserve"> }}</w:t>
       </w:r>
     </w:p>
     <w:p>
       <w:pPr>
         <w:rPr>
-          <w:lang w:val="en-US"/>
+          <w:rFonts w:ascii="Times New Roman" w:hAnsi="Times New Roman" w:cs="Times New Roman"/>
+          <w:sz w:val="24"/>
+          <w:szCs w:val="24"/>
         </w:rPr>
       </w:pPr>
       <w:r>
-        <w:t xml:space="preserve">Клиент: </w:t>
+        <w:rPr>
+          <w:rFonts w:ascii="Times New Roman" w:hAnsi="Times New Roman" w:cs="Times New Roman"/>
+          <w:sz w:val="24"/>
+          <w:szCs w:val="24"/>
+        </w:rPr>
+        <w:t>Дата: {</w:t>
+      </w:r>
+      <w:proofErr w:type="gramStart"/>
+      <w:r>
+        <w:rPr>
+          <w:rFonts w:ascii="Times New Roman" w:hAnsi="Times New Roman" w:cs="Times New Roman"/>
+          <w:sz w:val="24"/>
+          <w:szCs w:val="24"/>
+        </w:rPr>
+        <w:t xml:space="preserve">{ </w:t>
+      </w:r>
+      <w:proofErr w:type="spellStart"/>
+      <w:proofErr w:type="gramEnd"/>
+      <w:r>
+        <w:rPr>
+          <w:rFonts w:ascii="Times New Roman" w:hAnsi="Times New Roman" w:cs="Times New Roman"/>
+          <w:sz w:val="24"/>
+          <w:szCs w:val="24"/>
+        </w:rPr>
+        <w:t>date</w:t>
+      </w:r>
+      <w:proofErr w:type="spellEnd"/>
+      <w:r>
+        <w:rPr>
+          <w:rFonts w:ascii="Times New Roman" w:hAnsi="Times New Roman" w:cs="Times New Roman"/>
+          <w:sz w:val="24"/>
+          <w:szCs w:val="24"/>
+        </w:rPr>
+        <w:t xml:space="preserve"> }}</w:t>
       </w:r>
     </w:p>
     <w:p>
-      <w:r>
-        <w:t xml:space="preserve">{{ </w:t>
+      <w:pPr>
+        <w:rPr>
+          <w:rFonts w:ascii="Times New Roman" w:hAnsi="Times New Roman" w:cs="Times New Roman"/>
+          <w:sz w:val="24"/>
+          <w:szCs w:val="24"/>
+        </w:rPr>
+      </w:pPr>
+      <w:r>
+        <w:rPr>
+          <w:rFonts w:ascii="Times New Roman" w:hAnsi="Times New Roman" w:cs="Times New Roman"/>
+          <w:sz w:val="24"/>
+          <w:szCs w:val="24"/>
+        </w:rPr>
+        <w:t xml:space="preserve">Поставщик: </w:t>
+      </w:r>
+      <w:r>
+        <w:rPr>
+          <w:rFonts w:ascii="Times New Roman" w:eastAsia="Times New Roman" w:hAnsi="Times New Roman" w:cs="Times New Roman"/>
+          <w:sz w:val="24"/>
+          <w:szCs w:val="24"/>
+          <w:lang w:eastAsia="ru-RU"/>
+        </w:rPr>
+        <w:t>ООО «АЯКС» ИНН 7451432609 КПП 744701001</w:t>
+      </w:r>
+    </w:p>
+    <w:p>
+      <w:pPr>
+        <w:rPr>
+          <w:rFonts w:ascii="Times New Roman" w:hAnsi="Times New Roman" w:cs="Times New Roman"/>
+          <w:sz w:val="24"/>
+          <w:szCs w:val="24"/>
+          <w:lang w:val="en-US"/>
+        </w:rPr>
+      </w:pPr>
+      <w:r>
+        <w:rPr>
+          <w:rFonts w:ascii="Times New Roman" w:hAnsi="Times New Roman" w:cs="Times New Roman"/>
+          <w:sz w:val="24"/>
+          <w:szCs w:val="24"/>
+        </w:rPr>
+        <w:t>Клиент: {</w:t>
+      </w:r>
+      <w:proofErr w:type="gramStart"/>
+      <w:r>
+        <w:rPr>
+          <w:rFonts w:ascii="Times New Roman" w:hAnsi="Times New Roman" w:cs="Times New Roman"/>
+          <w:sz w:val="24"/>
+          <w:szCs w:val="24"/>
+        </w:rPr>
+        <w:t xml:space="preserve">{ </w:t>
       </w:r>
       <w:proofErr w:type="spellStart"/>
-      <w:r>
+      <w:proofErr w:type="gramEnd"/>
+      <w:r>
+        <w:rPr>
+          <w:rFonts w:ascii="Times New Roman" w:hAnsi="Times New Roman" w:cs="Times New Roman"/>
+          <w:sz w:val="24"/>
+          <w:szCs w:val="24"/>
+        </w:rPr>
         <w:t>client_name</w:t>
       </w:r>
       <w:proofErr w:type="spellEnd"/>
-      <w:proofErr w:type="gramStart"/>
-      <w:r>
-        <w:t xml:space="preserve"> </w:t>
-      </w:r>
-      <w:r>
-        <w:t>}</w:t>
-      </w:r>
-      <w:proofErr w:type="gramEnd"/>
-      <w:r>
-        <w:t>}</w:t>
-      </w:r>
+      <w:r>
+        <w:rPr>
+          <w:rFonts w:ascii="Times New Roman" w:hAnsi="Times New Roman" w:cs="Times New Roman"/>
+          <w:sz w:val="24"/>
+          <w:szCs w:val="24"/>
+        </w:rPr>
+        <w:t xml:space="preserve"> }}</w:t>
+      </w:r>
+    </w:p>
+    <w:p>
+      <w:pPr>
+        <w:rPr>
+          <w:rFonts w:ascii="Times New Roman" w:hAnsi="Times New Roman" w:cs="Times New Roman"/>
+          <w:sz w:val="28"/>
+          <w:szCs w:val="28"/>
+          <w:lang w:val="en-US"/>
+        </w:rPr>
+      </w:pPr>
     </w:p>
     <w:tbl>
       <w:tblPr>
@@ -559,7 +637,19 @@
             <w:tcW w:w="675" w:type="dxa"/>
           </w:tcPr>
           <w:p>
+            <w:pPr>
+              <w:rPr>
+                <w:rFonts w:ascii="Times New Roman" w:hAnsi="Times New Roman" w:cs="Times New Roman"/>
+                <w:sz w:val="28"/>
+                <w:szCs w:val="28"/>
+              </w:rPr>
+            </w:pPr>
             <w:r>
+              <w:rPr>
+                <w:rFonts w:ascii="Times New Roman" w:hAnsi="Times New Roman" w:cs="Times New Roman"/>
+                <w:sz w:val="28"/>
+                <w:szCs w:val="28"/>
+              </w:rPr>
               <w:t>№</w:t>
             </w:r>
           </w:p>
@@ -569,7 +659,19 @@
             <w:tcW w:w="2977" w:type="dxa"/>
           </w:tcPr>
           <w:p>
+            <w:pPr>
+              <w:rPr>
+                <w:rFonts w:ascii="Times New Roman" w:hAnsi="Times New Roman" w:cs="Times New Roman"/>
+                <w:sz w:val="28"/>
+                <w:szCs w:val="28"/>
+              </w:rPr>
+            </w:pPr>
             <w:r>
+              <w:rPr>
+                <w:rFonts w:ascii="Times New Roman" w:hAnsi="Times New Roman" w:cs="Times New Roman"/>
+                <w:sz w:val="28"/>
+                <w:szCs w:val="28"/>
+              </w:rPr>
               <w:t>Наименование</w:t>
             </w:r>
           </w:p>
@@ -579,7 +681,19 @@
             <w:tcW w:w="851" w:type="dxa"/>
           </w:tcPr>
           <w:p>
+            <w:pPr>
+              <w:rPr>
+                <w:rFonts w:ascii="Times New Roman" w:hAnsi="Times New Roman" w:cs="Times New Roman"/>
+                <w:sz w:val="28"/>
+                <w:szCs w:val="28"/>
+              </w:rPr>
+            </w:pPr>
             <w:r>
+              <w:rPr>
+                <w:rFonts w:ascii="Times New Roman" w:hAnsi="Times New Roman" w:cs="Times New Roman"/>
+                <w:sz w:val="28"/>
+                <w:szCs w:val="28"/>
+              </w:rPr>
               <w:t>Ед.</w:t>
             </w:r>
           </w:p>
@@ -589,7 +703,19 @@
             <w:tcW w:w="1672" w:type="dxa"/>
           </w:tcPr>
           <w:p>
+            <w:pPr>
+              <w:rPr>
+                <w:rFonts w:ascii="Times New Roman" w:hAnsi="Times New Roman" w:cs="Times New Roman"/>
+                <w:sz w:val="28"/>
+                <w:szCs w:val="28"/>
+              </w:rPr>
+            </w:pPr>
             <w:r>
+              <w:rPr>
+                <w:rFonts w:ascii="Times New Roman" w:hAnsi="Times New Roman" w:cs="Times New Roman"/>
+                <w:sz w:val="28"/>
+                <w:szCs w:val="28"/>
+              </w:rPr>
               <w:t>Кол-во</w:t>
             </w:r>
           </w:p>
@@ -599,7 +725,19 @@
             <w:tcW w:w="1589" w:type="dxa"/>
           </w:tcPr>
           <w:p>
+            <w:pPr>
+              <w:rPr>
+                <w:rFonts w:ascii="Times New Roman" w:hAnsi="Times New Roman" w:cs="Times New Roman"/>
+                <w:sz w:val="28"/>
+                <w:szCs w:val="28"/>
+              </w:rPr>
+            </w:pPr>
             <w:r>
+              <w:rPr>
+                <w:rFonts w:ascii="Times New Roman" w:hAnsi="Times New Roman" w:cs="Times New Roman"/>
+                <w:sz w:val="28"/>
+                <w:szCs w:val="28"/>
+              </w:rPr>
               <w:t>Цена</w:t>
             </w:r>
           </w:p>
@@ -609,7 +747,19 @@
             <w:tcW w:w="1591" w:type="dxa"/>
           </w:tcPr>
           <w:p>
+            <w:pPr>
+              <w:rPr>
+                <w:rFonts w:ascii="Times New Roman" w:hAnsi="Times New Roman" w:cs="Times New Roman"/>
+                <w:sz w:val="28"/>
+                <w:szCs w:val="28"/>
+              </w:rPr>
+            </w:pPr>
             <w:r>
+              <w:rPr>
+                <w:rFonts w:ascii="Times New Roman" w:hAnsi="Times New Roman" w:cs="Times New Roman"/>
+                <w:sz w:val="28"/>
+                <w:szCs w:val="28"/>
+              </w:rPr>
               <w:t>Сумма</w:t>
             </w:r>
           </w:p>
@@ -621,7 +771,19 @@
             <w:tcW w:w="675" w:type="dxa"/>
           </w:tcPr>
           <w:p>
+            <w:pPr>
+              <w:rPr>
+                <w:rFonts w:ascii="Times New Roman" w:hAnsi="Times New Roman" w:cs="Times New Roman"/>
+                <w:sz w:val="28"/>
+                <w:szCs w:val="28"/>
+              </w:rPr>
+            </w:pPr>
             <w:r>
+              <w:rPr>
+                <w:rFonts w:ascii="Times New Roman" w:hAnsi="Times New Roman" w:cs="Times New Roman"/>
+                <w:sz w:val="28"/>
+                <w:szCs w:val="28"/>
+              </w:rPr>
               <w:t>1</w:t>
             </w:r>
           </w:p>
@@ -631,7 +793,19 @@
             <w:tcW w:w="2977" w:type="dxa"/>
           </w:tcPr>
           <w:p>
+            <w:pPr>
+              <w:rPr>
+                <w:rFonts w:ascii="Times New Roman" w:hAnsi="Times New Roman" w:cs="Times New Roman"/>
+                <w:sz w:val="28"/>
+                <w:szCs w:val="28"/>
+              </w:rPr>
+            </w:pPr>
             <w:r>
+              <w:rPr>
+                <w:rFonts w:ascii="Times New Roman" w:hAnsi="Times New Roman" w:cs="Times New Roman"/>
+                <w:sz w:val="28"/>
+                <w:szCs w:val="28"/>
+              </w:rPr>
               <w:t>Товар</w:t>
             </w:r>
           </w:p>
@@ -641,7 +815,19 @@
             <w:tcW w:w="851" w:type="dxa"/>
           </w:tcPr>
           <w:p>
+            <w:pPr>
+              <w:rPr>
+                <w:rFonts w:ascii="Times New Roman" w:hAnsi="Times New Roman" w:cs="Times New Roman"/>
+                <w:sz w:val="28"/>
+                <w:szCs w:val="28"/>
+              </w:rPr>
+            </w:pPr>
             <w:r>
+              <w:rPr>
+                <w:rFonts w:ascii="Times New Roman" w:hAnsi="Times New Roman" w:cs="Times New Roman"/>
+                <w:sz w:val="28"/>
+                <w:szCs w:val="28"/>
+              </w:rPr>
               <w:t>Ед.</w:t>
             </w:r>
           </w:p>
@@ -651,7 +837,19 @@
             <w:tcW w:w="1672" w:type="dxa"/>
           </w:tcPr>
           <w:p>
+            <w:pPr>
+              <w:rPr>
+                <w:rFonts w:ascii="Times New Roman" w:hAnsi="Times New Roman" w:cs="Times New Roman"/>
+                <w:sz w:val="28"/>
+                <w:szCs w:val="28"/>
+              </w:rPr>
+            </w:pPr>
             <w:r>
+              <w:rPr>
+                <w:rFonts w:ascii="Times New Roman" w:hAnsi="Times New Roman" w:cs="Times New Roman"/>
+                <w:sz w:val="28"/>
+                <w:szCs w:val="28"/>
+              </w:rPr>
               <w:t>1</w:t>
             </w:r>
           </w:p>
@@ -661,7 +859,19 @@
             <w:tcW w:w="1589" w:type="dxa"/>
           </w:tcPr>
           <w:p>
+            <w:pPr>
+              <w:rPr>
+                <w:rFonts w:ascii="Times New Roman" w:hAnsi="Times New Roman" w:cs="Times New Roman"/>
+                <w:sz w:val="28"/>
+                <w:szCs w:val="28"/>
+              </w:rPr>
+            </w:pPr>
             <w:r>
+              <w:rPr>
+                <w:rFonts w:ascii="Times New Roman" w:hAnsi="Times New Roman" w:cs="Times New Roman"/>
+                <w:sz w:val="28"/>
+                <w:szCs w:val="28"/>
+              </w:rPr>
               <w:t>0</w:t>
             </w:r>
           </w:p>
@@ -673,86 +883,196 @@
           <w:p>
             <w:pPr>
               <w:rPr>
+                <w:rFonts w:ascii="Times New Roman" w:hAnsi="Times New Roman" w:cs="Times New Roman"/>
+                <w:sz w:val="28"/>
+                <w:szCs w:val="28"/>
                 <w:lang w:val="en-US"/>
               </w:rPr>
             </w:pPr>
             <w:r>
+              <w:rPr>
+                <w:rFonts w:ascii="Times New Roman" w:hAnsi="Times New Roman" w:cs="Times New Roman"/>
+                <w:sz w:val="28"/>
+                <w:szCs w:val="28"/>
+              </w:rPr>
               <w:t>0</w:t>
             </w:r>
           </w:p>
         </w:tc>
       </w:tr>
     </w:tbl>
-    <w:p/>
     <w:p>
-      <w:r>
-        <w:t>Итого:</w:t>
-      </w:r>
+      <w:pPr>
+        <w:rPr>
+          <w:rFonts w:ascii="Times New Roman" w:hAnsi="Times New Roman" w:cs="Times New Roman"/>
+          <w:sz w:val="28"/>
+          <w:szCs w:val="28"/>
+        </w:rPr>
+      </w:pPr>
     </w:p>
     <w:p>
-      <w:r>
-        <w:t xml:space="preserve"> {{ </w:t>
+      <w:pPr>
+        <w:jc w:val="right"/>
+        <w:rPr>
+          <w:rFonts w:ascii="Times New Roman" w:hAnsi="Times New Roman" w:cs="Times New Roman"/>
+          <w:sz w:val="24"/>
+          <w:szCs w:val="24"/>
+        </w:rPr>
+      </w:pPr>
+      <w:r>
+        <w:rPr>
+          <w:rFonts w:ascii="Times New Roman" w:hAnsi="Times New Roman" w:cs="Times New Roman"/>
+          <w:sz w:val="24"/>
+          <w:szCs w:val="24"/>
+        </w:rPr>
+        <w:t>Итого:</w:t>
+      </w:r>
+      <w:r>
+        <w:rPr>
+          <w:rFonts w:ascii="Times New Roman" w:hAnsi="Times New Roman" w:cs="Times New Roman"/>
+          <w:sz w:val="24"/>
+          <w:szCs w:val="24"/>
+        </w:rPr>
+        <w:t xml:space="preserve"> {</w:t>
+      </w:r>
+      <w:proofErr w:type="gramStart"/>
+      <w:r>
+        <w:rPr>
+          <w:rFonts w:ascii="Times New Roman" w:hAnsi="Times New Roman" w:cs="Times New Roman"/>
+          <w:sz w:val="24"/>
+          <w:szCs w:val="24"/>
+        </w:rPr>
+        <w:t xml:space="preserve">{ </w:t>
       </w:r>
       <w:proofErr w:type="spellStart"/>
-      <w:r>
+      <w:proofErr w:type="gramEnd"/>
+      <w:r>
+        <w:rPr>
+          <w:rFonts w:ascii="Times New Roman" w:hAnsi="Times New Roman" w:cs="Times New Roman"/>
+          <w:sz w:val="24"/>
+          <w:szCs w:val="24"/>
+        </w:rPr>
         <w:t>total</w:t>
       </w:r>
       <w:proofErr w:type="spellEnd"/>
-      <w:proofErr w:type="gramStart"/>
-      <w:r>
-        <w:t xml:space="preserve"> }</w:t>
-      </w:r>
-      <w:proofErr w:type="gramEnd"/>
-      <w:r>
-        <w:t>}</w:t>
+      <w:r>
+        <w:rPr>
+          <w:rFonts w:ascii="Times New Roman" w:hAnsi="Times New Roman" w:cs="Times New Roman"/>
+          <w:sz w:val="24"/>
+          <w:szCs w:val="24"/>
+        </w:rPr>
+        <w:t xml:space="preserve"> }}</w:t>
       </w:r>
     </w:p>
     <w:p>
-      <w:r>
+      <w:pPr>
+        <w:jc w:val="right"/>
+        <w:rPr>
+          <w:rFonts w:ascii="Times New Roman" w:hAnsi="Times New Roman" w:cs="Times New Roman"/>
+          <w:sz w:val="24"/>
+          <w:szCs w:val="24"/>
+        </w:rPr>
+      </w:pPr>
+      <w:r>
+        <w:rPr>
+          <w:rFonts w:ascii="Times New Roman" w:hAnsi="Times New Roman" w:cs="Times New Roman"/>
+          <w:sz w:val="24"/>
+          <w:szCs w:val="24"/>
+        </w:rPr>
         <w:t>НДС 22%:</w:t>
+      </w:r>
+      <w:r>
+        <w:rPr>
+          <w:rFonts w:ascii="Times New Roman" w:hAnsi="Times New Roman" w:cs="Times New Roman"/>
+          <w:sz w:val="24"/>
+          <w:szCs w:val="24"/>
+        </w:rPr>
+        <w:t xml:space="preserve">  {</w:t>
+      </w:r>
+      <w:proofErr w:type="gramStart"/>
+      <w:r>
+        <w:rPr>
+          <w:rFonts w:ascii="Times New Roman" w:hAnsi="Times New Roman" w:cs="Times New Roman"/>
+          <w:sz w:val="24"/>
+          <w:szCs w:val="24"/>
+        </w:rPr>
+        <w:t xml:space="preserve">{ </w:t>
+      </w:r>
+      <w:proofErr w:type="spellStart"/>
+      <w:proofErr w:type="gramEnd"/>
+      <w:r>
+        <w:rPr>
+          <w:rFonts w:ascii="Times New Roman" w:hAnsi="Times New Roman" w:cs="Times New Roman"/>
+          <w:sz w:val="24"/>
+          <w:szCs w:val="24"/>
+        </w:rPr>
+        <w:t>vat</w:t>
+      </w:r>
+      <w:proofErr w:type="spellEnd"/>
+      <w:r>
+        <w:rPr>
+          <w:rFonts w:ascii="Times New Roman" w:hAnsi="Times New Roman" w:cs="Times New Roman"/>
+          <w:sz w:val="24"/>
+          <w:szCs w:val="24"/>
+        </w:rPr>
+        <w:t xml:space="preserve"> }}</w:t>
       </w:r>
     </w:p>
     <w:p>
-      <w:r>
-        <w:t xml:space="preserve"> {{ </w:t>
+      <w:pPr>
+        <w:jc w:val="right"/>
+        <w:rPr>
+          <w:rFonts w:ascii="Times New Roman" w:hAnsi="Times New Roman" w:cs="Times New Roman"/>
+          <w:sz w:val="24"/>
+          <w:szCs w:val="24"/>
+        </w:rPr>
+      </w:pPr>
+      <w:r>
+        <w:rPr>
+          <w:rFonts w:ascii="Times New Roman" w:hAnsi="Times New Roman" w:cs="Times New Roman"/>
+          <w:sz w:val="24"/>
+          <w:szCs w:val="24"/>
+        </w:rPr>
+        <w:t xml:space="preserve">Итого с НДС: </w:t>
+      </w:r>
+      <w:r>
+        <w:rPr>
+          <w:rFonts w:ascii="Times New Roman" w:hAnsi="Times New Roman" w:cs="Times New Roman"/>
+          <w:sz w:val="24"/>
+          <w:szCs w:val="24"/>
+        </w:rPr>
+        <w:t>{</w:t>
+      </w:r>
+      <w:proofErr w:type="gramStart"/>
+      <w:r>
+        <w:rPr>
+          <w:rFonts w:ascii="Times New Roman" w:hAnsi="Times New Roman" w:cs="Times New Roman"/>
+          <w:sz w:val="24"/>
+          <w:szCs w:val="24"/>
+        </w:rPr>
+        <w:t xml:space="preserve">{ </w:t>
       </w:r>
       <w:proofErr w:type="spellStart"/>
-      <w:r>
-        <w:t>vat</w:t>
+      <w:proofErr w:type="gramEnd"/>
+      <w:r>
+        <w:rPr>
+          <w:rFonts w:ascii="Times New Roman" w:hAnsi="Times New Roman" w:cs="Times New Roman"/>
+          <w:sz w:val="24"/>
+          <w:szCs w:val="24"/>
+        </w:rPr>
+        <w:t>total_with_vat</w:t>
       </w:r>
       <w:proofErr w:type="spellEnd"/>
-      <w:proofErr w:type="gramStart"/>
-      <w:r>
-        <w:t xml:space="preserve"> }</w:t>
-      </w:r>
-      <w:proofErr w:type="gramEnd"/>
-      <w:r>
-        <w:t>}</w:t>
+      <w:r>
+        <w:rPr>
+          <w:rFonts w:ascii="Times New Roman" w:hAnsi="Times New Roman" w:cs="Times New Roman"/>
+          <w:sz w:val="24"/>
+          <w:szCs w:val="24"/>
+        </w:rPr>
+        <w:t xml:space="preserve"> }}</w:t>
       </w:r>
     </w:p>
-    <w:p>
-      <w:r>
-        <w:t xml:space="preserve">Итого с НДС: </w:t>
-      </w:r>
-    </w:p>
-    <w:p>
-      <w:r>
-        <w:t xml:space="preserve">{{ </w:t>
-      </w:r>
-      <w:proofErr w:type="spellStart"/>
-      <w:r>
-        <w:t>total_with_vat</w:t>
-      </w:r>
-      <w:proofErr w:type="spellEnd"/>
-      <w:proofErr w:type="gramStart"/>
-      <w:r>
-        <w:t xml:space="preserve"> }</w:t>
-      </w:r>
-      <w:proofErr w:type="gramEnd"/>
-      <w:r>
-        <w:t>}</w:t>
-      </w:r>
-    </w:p>
+    <w:p/>
     <w:sectPr>
       <w:pgSz w:w="11906" w:h="16838"/>
       <w:pgMar w:top="1134" w:right="850" w:bottom="1134" w:left="1701" w:header="708" w:footer="708" w:gutter="0"/>

</xml_diff>